<commit_message>
Caso laboral K. Carmona: adenda reforzada y valoración del contrato civil (E-011)
Se retira la disposición transitoria (el material desde el 22/10 se resuelve
aparte) y se incorporan no retroactividad, subsanación, trazabilidad y
modalidades de cesión de derechos.

Co-Authored-By: Claude Opus 5.5 <noreply@anthropic.com>
Claude-Session: https://claude.ai/code/session_01V7BfzBTA8TEWMK1apGBBKC
</commit_message>
<xml_diff>
--- a/casos/laboral-kcarmona/escritos/2026-10-27_Propuesta_Adenda_Produccion_Audiovisual_KCarmona.docx
+++ b/casos/laboral-kcarmona/escritos/2026-10-27_Propuesta_Adenda_Produccion_Audiovisual_KCarmona.docx
@@ -126,6 +126,20 @@
     </w:p>
     <w:p>
       <w:pPr>
+        <w:spacing w:before="0" w:after="120" w:line="300" w:lineRule="auto"/>
+      </w:pPr>
+      <w:r>
+        <w:rPr>
+          <w:rFonts w:ascii="Georgia" w:hAnsi="Georgia"/>
+          <w:b w:val="0"/>
+          <w:color w:val="2F2E47"/>
+          <w:sz w:val="21"/>
+        </w:rPr>
+        <w:t>Se aplica a los encargos posteriores a su firma. No modifica ni sustituye obligaciones generadas antes de ella.</w:t>
+      </w:r>
+    </w:p>
+    <w:p>
+      <w:pPr>
         <w:spacing w:before="280" w:after="120" w:line="300" w:lineRule="auto"/>
         <w:pBdr>
           <w:bottom w:val="single" w:sz="6" w:space="4" w:color="D1D0CB"/>
@@ -239,7 +253,21 @@
           <w:color w:val="2F2E47"/>
           <w:sz w:val="21"/>
         </w:rPr>
-        <w:t>El video se entrega por el canal institucional indicado en el encargo. La jefatura lo aprueba, o solicita ajustes por escrito, dentro de los tres días hábiles siguientes a la entrega. Los ajustes se solicitan una sola vez. Si no hay respuesta en ese plazo, el video se tiene por aprobado.</w:t>
+        <w:t>El video se entrega por el canal institucional indicado en el encargo. La jefatura lo aprueba, o solicita ajustes por escrito, dentro de los tres días hábiles siguientes a la entrega. Los ajustes se solicitan una sola vez y se realizan en el plazo que se acuerde por escrito. Si no hay respuesta en el plazo de revisión, el video se tiene por aprobado.</w:t>
+      </w:r>
+    </w:p>
+    <w:p>
+      <w:pPr>
+        <w:spacing w:before="0" w:after="120" w:line="300" w:lineRule="auto"/>
+      </w:pPr>
+      <w:r>
+        <w:rPr>
+          <w:rFonts w:ascii="Georgia" w:hAnsi="Georgia"/>
+          <w:b w:val="0"/>
+          <w:color w:val="2F2E47"/>
+          <w:sz w:val="21"/>
+        </w:rPr>
+        <w:t>Cada encargo, entrega, aprobación y pago queda registrado por escrito en el canal institucional.</w:t>
       </w:r>
     </w:p>
     <w:p>
@@ -329,7 +357,21 @@
           <w:color w:val="2F2E47"/>
           <w:sz w:val="21"/>
         </w:rPr>
-        <w:t>Los videos se producen por encargo de Poïesis. Los derechos patrimoniales de autor pertenecen a Poïesis, que podrá usarlos, editarlos y difundirlos por cualquier medio. La Trabajadora conserva los derechos morales que la ley le reconoce como autora.</w:t>
+        <w:t>Los videos se producen por encargo de Poïesis. Los derechos patrimoniales de autor, en sus modalidades de reproducción, distribución, comunicación pública y transformación, pertenecen a Poïesis en forma exclusiva, sin límite de territorio y por todo el plazo de protección legal. La Trabajadora conserva los derechos morales que la ley le reconoce como autora.</w:t>
+      </w:r>
+    </w:p>
+    <w:p>
+      <w:pPr>
+        <w:spacing w:before="0" w:after="120" w:line="300" w:lineRule="auto"/>
+      </w:pPr>
+      <w:r>
+        <w:rPr>
+          <w:rFonts w:ascii="Georgia" w:hAnsi="Georgia"/>
+          <w:b w:val="0"/>
+          <w:color w:val="2F2E47"/>
+          <w:sz w:val="21"/>
+        </w:rPr>
+        <w:t>La Trabajadora utiliza en los videos solo música, imágenes u otros materiales de terceros con licencia o de uso libre, e informa su origen al entregar el video.</w:t>
       </w:r>
     </w:p>
     <w:p>
@@ -435,37 +477,7 @@
           <w:color w:val="131237"/>
           <w:sz w:val="28"/>
         </w:rPr>
-        <w:t>Undécima. Disposición transitoria</w:t>
-      </w:r>
-    </w:p>
-    <w:p>
-      <w:pPr>
-        <w:spacing w:before="0" w:after="120" w:line="300" w:lineRule="auto"/>
-      </w:pPr>
-      <w:r>
-        <w:rPr>
-          <w:rFonts w:ascii="Georgia" w:hAnsi="Georgia"/>
-          <w:b w:val="0"/>
-          <w:color w:val="2F2E47"/>
-          <w:sz w:val="21"/>
-        </w:rPr>
-        <w:t>Los videos entregados entre el 22 de octubre de 2026 y la firma de esta adenda se pagan conforme a ________________________________________.</w:t>
-      </w:r>
-    </w:p>
-    <w:p>
-      <w:pPr>
-        <w:spacing w:before="280" w:after="120" w:line="300" w:lineRule="auto"/>
-        <w:pBdr>
-          <w:bottom w:val="single" w:sz="6" w:space="4" w:color="D1D0CB"/>
-        </w:pBdr>
-      </w:pPr>
-      <w:r>
-        <w:rPr>
-          <w:rFonts w:ascii="Safira March" w:hAnsi="Safira March"/>
-          <w:color w:val="131237"/>
-          <w:sz w:val="28"/>
-        </w:rPr>
-        <w:t>Duodécima. Voluntariedad</w:t>
+        <w:t>Undécima. Voluntariedad</w:t>
       </w:r>
     </w:p>
     <w:p>

</xml_diff>